<commit_message>
Finalize funding and COI declarations per author's elections; bundles rebuilt
Funding: no external funding. COI: standard wording (provider
partnership, no role in design/analysis/publication). Ethics
working-draft note retained per author's election to await the
approval memo - now the last blocking item before JIKM submission.

Co-Authored-By: Claude Fable 5 <noreply@anthropic.com>
Claude-Session: https://claude.ai/code/session_01KoT3i8geZspYBMMKVYJUTG
</commit_message>
<xml_diff>
--- a/docs/papers/Paper2_JIKM_Manuscript.docx
+++ b/docs/papers/Paper2_JIKM_Manuscript.docx
@@ -4082,7 +4082,7 @@
         <w:jc w:val="both"/>
       </w:pPr>
       <w:r>
-        <w:t>Funding. [FUNDING STATEMENT TO BE CONFIRMED BY THE AUTHORS: no external funding or programme support has been recorded for this study — please confirm, or supply the applicable funding acknowledgement.]</w:t>
+        <w:t>Funding. This research received no external funding.</w:t>
       </w:r>
     </w:p>
     <w:p>
@@ -4090,7 +4090,7 @@
         <w:jc w:val="both"/>
       </w:pPr>
       <w:r>
-        <w:t>Conflicts of interest. [CONFLICTS-OF-INTEREST STATEMENT TO BE CONFIRMED BY THE AUTHORS: the first author is a part-time EngD candidate; the study was conducted in partnership with an industrial partner (Dr Migar), and the characterisation of that relationship is at draft-review level — please confirm the final wording, including any interests arising from the industrial partnership.]</w:t>
+        <w:t>Conflicts of interest. The authors declare no competing financial interests. The study was conducted in partnership with the residential care provider operating the study facility; the provider had no role in study design, analysis, or the decision to publish.</w:t>
       </w:r>
     </w:p>
     <w:p>

</xml_diff>